<commit_message>
Fix IP Q5 (add TTL as changing field), strengthen ICMP Q9, retake screenshots
- IP Q5: Now correctly uses tracert capture; identifies TTL, Identification,
  and Checksum as changing fields (previously missed TTL)
- ICMP Q9: Added Echo Reply screenshot from ping as comparison evidence;
  explains why tracert didn't complete and infers hop count from TTL
- All 11 screenshots retaken without Enabled Protocols dialog
- Suppress Wireshark save dialog with gui.ask_unsaved:FALSE

Co-Authored-By: Claude Opus 4.6 (1M context) <noreply@anthropic.com>
</commit_message>
<xml_diff>
--- a/Lab3_Report_Cheng Wui Sum_22074221D.docx
+++ b/Lab3_Report_Cheng Wui Sum_22074221D.docx
@@ -117,7 +117,18 @@
     </w:p>
     <w:p>
       <w:r>
-        <w:t>The IP header is 20 bytes long, indicated by the Header Length field: IHL = 5 (5 × 4 = 20 bytes). The IP payload is 64 bytes, calculated as: Total Length (84) − Header Length (20) = 64 bytes. The 64-byte payload consists of the 8-byte ICMP header (Type, Code, Checksum, Identifier, Sequence Number) plus 56 bytes of ICMP data ("abcdefghijklmnop..." padding).</w:t>
+        <w:t>From the first ICMP Echo Request (Frame 61, 56-byte ping to www.inria.fr):</w:t>
+        <w:br/>
+        <w:br/>
+        <w:t>The IP header is 20 bytes long. This is determined from the Header Length (IHL) field, which has a value of 5, meaning 5 × 4 = 20 bytes.</w:t>
+        <w:br/>
+        <w:br/>
+        <w:t>The IP payload is 64 bytes. This is calculated as:</w:t>
+        <w:br/>
+        <w:t xml:space="preserve">    Total Length (84 bytes) − IP Header Length (20 bytes) = 64 bytes</w:t>
+        <w:br/>
+        <w:br/>
+        <w:t>The 64-byte payload consists of the 8-byte ICMP header (Type, Code, Checksum, Identifier, Sequence Number) plus 56 bytes of ICMP data ("abcdefghijklmnop..." padding), totalling 8 + 56 = 64 bytes.</w:t>
       </w:r>
     </w:p>
     <w:p>
@@ -149,7 +160,7 @@
               <a:graphicData uri="http://schemas.openxmlformats.org/drawingml/2006/picture">
                 <pic:pic>
                   <pic:nvPicPr>
-                    <pic:cNvPr id="0" name="ip_q5_q7_id_pattern.png"/>
+                    <pic:cNvPr id="0" name="ip_q5_q7_tracert_pattern.png"/>
                     <pic:cNvPicPr/>
                   </pic:nvPicPr>
                   <pic:blipFill>
@@ -174,14 +185,22 @@
     </w:p>
     <w:p>
       <w:r>
-        <w:t>The fields that always change are:</w:t>
-        <w:br/>
-        <w:t>1. Identification — increments by 1 each packet (0x0b71, 0x0b72, 0x0b73, ..., 0x0b7a)</w:t>
-        <w:br/>
-        <w:t>2. Header Checksum — recomputed for each datagram since the Identification field changed</w:t>
+        <w:t>Examining the series of ICMP Echo Request packets sent by tracert to www.inria.fr (lab3_icmp_tracert.pcapng), the fields that always change are:</w:t>
         <w:br/>
         <w:br/>
-        <w:t>Fields that stay constant: Version (4), Header Length (20), DSCP (0x00), Total Length (60), Flags (0x00), Fragment Offset (0), TTL (128), Protocol (ICMP/1), Source IP (192.168.68.75), Destination IP (143.89.209.9). The constant fields must stay the same because they describe the same type of packet to the same destination. The Identification and Checksum must change because each datagram needs a unique ID for reassembly, and the checksum covers the header.</w:t>
+        <w:t>1. TTL (Time to Live) — increments with each group of probes: 1, 1, 1, 2, 2, 2, 3, 3, 3, ...</w:t>
+        <w:br/>
+        <w:t xml:space="preserve">   This is the core mechanism of traceroute.</w:t>
+        <w:br/>
+        <w:t>2. Identification — increments by 1 for each datagram: 0xda8a, 0xda8b, 0xda8c, 0xda8d, ...</w:t>
+        <w:br/>
+        <w:t>3. Header Checksum — recomputed for each datagram since TTL and Identification changed.</w:t>
+        <w:br/>
+        <w:br/>
+        <w:t>Fields that stay constant: Version (4), Header Length (20 bytes), DSCP (0x00), Total Length (92), Flags (0x00), Fragment Offset (0), Protocol (ICMP/1), Source IP (192.168.68.75), Destination IP (128.93.162.83).</w:t>
+        <w:br/>
+        <w:br/>
+        <w:t>The constant fields must stay the same because they describe the same type of probe packet to the same destination. TTL must change because that is how traceroute discovers each hop. Identification must change because each datagram needs a unique ID for reassembly purposes. Checksum must change because it covers the entire header including the fields that changed.</w:t>
       </w:r>
     </w:p>
     <w:p>
@@ -202,7 +221,13 @@
     </w:p>
     <w:p>
       <w:r>
-        <w:t>As shown in the screenshot above, the Identification field increments sequentially by exactly 1 for each successive ICMP Echo Request: 0x0b71 (2929), 0x0b72 (2930), 0x0b73 (2931), ..., 0x0b7a (2938). This is the standard behavior of the Windows IP stack, which uses a simple incrementing global counter for the Identification field.</w:t>
+        <w:t>As annotated in the screenshot above, the Identification field increments sequentially by exactly 1 for each successive ICMP Echo Request sent by the host:</w:t>
+        <w:br/>
+        <w:br/>
+        <w:t xml:space="preserve">  0xda8a (55946) → 0xda8b (55947) → 0xda8c (55948) → 0xda8d (55949) → ...</w:t>
+        <w:br/>
+        <w:br/>
+        <w:t>This is the standard behavior of the Windows IP stack, which uses a simple incrementing global counter for the Identification field. The counter is shared across all IP datagrams sent by the host, which is why consecutive traceroute probe packets show consecutive Identification values with no gaps.</w:t>
       </w:r>
     </w:p>
     <w:p>
@@ -259,11 +284,13 @@
     </w:p>
     <w:p>
       <w:r>
-        <w:t>The three TTL-exceeded replies from the first-hop router (192.168.68.1) show:</w:t>
+        <w:t>Examining the three ICMP TTL-exceeded replies from the first-hop router (192.168.68.1):</w:t>
         <w:br/>
-        <w:t>• TTL: constant at 64 for all three replies. This is expected — the router is one hop away and uses a default TTL of 64.</w:t>
         <w:br/>
-        <w:t>• Identification: changes between replies (0x1f50, 0x1f54, 0x1f57). This is expected because each ICMP TTL-exceeded reply is a new IP datagram generated by the router with its own incrementing Identification counter. The values are not strictly sequential because the router sends other IP datagrams between these replies.</w:t>
+        <w:t>• TTL: constant at 64 for all three replies. This is expected because the router is only one hop away, and it uses the default initial TTL of 64 (typical for Linux/Unix-based routers such as this TP-Link gateway).</w:t>
+        <w:br/>
+        <w:br/>
+        <w:t>• Identification: changes across replies — 0x1f50, 0x1f54, 0x1f57. This is expected because each ICMP TTL-exceeded reply is a new, independent IP datagram generated by the router. The router assigns a new Identification value from its own incrementing counter. The values are not strictly sequential (gaps of 4 and 3) because the router also sends other IP datagrams (e.g., ARP, routing updates) between these ICMP replies, consuming Identification numbers.</w:t>
       </w:r>
     </w:p>
     <w:p>
@@ -324,21 +351,26 @@
         <w:br/>
         <w:t>• Total Length: 1500 bytes</w:t>
         <w:br/>
-        <w:t>• Identification: 0xdab6</w:t>
+        <w:t>• Identification: 0xdab6 (55990)</w:t>
         <w:br/>
-        <w:t>• Flags: More Fragments (MF) = 1 — this indicates the datagram HAS been fragmented.</w:t>
+        <w:t>• Flags: More Fragments (MF) = 1</w:t>
         <w:br/>
-        <w:t>• Fragment Offset: 0 — this indicates it is the FIRST fragment.</w:t>
+        <w:t>• Fragment Offset: 0</w:t>
         <w:br/>
         <w:br/>
-        <w:t>How to distinguish first vs. latter fragments:</w:t>
-        <w:br/>
-        <w:t>• First fragment: MF = 1, Offset = 0</w:t>
-        <w:br/>
-        <w:t>• Latter fragment: Offset &gt; 0 (MF = 1 if more follow, MF = 0 if last)</w:t>
+        <w:t>What indicates fragmentation: The "More Fragments" (MF) flag is set to 1, indicating additional fragments follow this one.</w:t>
         <w:br/>
         <w:br/>
-        <w:t>This IP datagram is 1500 bytes long (maximum Ethernet MTU).</w:t>
+        <w:t>First vs. latter fragment:</w:t>
+        <w:br/>
+        <w:t>• First fragment: MF = 1, Fragment Offset = 0 (data starts at byte 0)</w:t>
+        <w:br/>
+        <w:t>• Middle fragment: MF = 1, Fragment Offset &gt; 0</w:t>
+        <w:br/>
+        <w:t>• Last fragment: MF = 0, Fragment Offset &gt; 0</w:t>
+        <w:br/>
+        <w:br/>
+        <w:t>This IP datagram is 1500 bytes long (the maximum Ethernet MTU of 1500 bytes).</w:t>
       </w:r>
     </w:p>
     <w:p>
@@ -381,13 +413,13 @@
       <w:r>
         <w:t>Second/last fragment (Frame 1338):</w:t>
         <w:br/>
-        <w:t>• Total Length: 548 bytes, MF = 0 (no more fragments), Offset = 1480</w:t>
+        <w:t>• Total Length: 548 bytes, MF = 0 (no more fragments), Fragment Offset = 1480 bytes</w:t>
         <w:br/>
-        <w:t>• Same Identification 0xdab6 confirms it belongs to the same original datagram.</w:t>
+        <w:t>• Same Identification (0xdab6) confirms it belongs to the same original datagram.</w:t>
         <w:br/>
-        <w:t>• Offset &gt; 0 indicates this is NOT the first fragment. MF = 0 indicates it is the last.</w:t>
+        <w:t>• Fragment Offset &gt; 0 confirms this is NOT the first fragment. MF = 0 confirms it is the last.</w:t>
         <w:br/>
-        <w:t>• Reassembled total: 1480 + 528 = 2008 bytes (20 IP header + 8 ICMP header + 2000 data - 20 = 2008 payload).</w:t>
+        <w:t>• Reassembled payload: 1480 + 528 = 2008 bytes (8-byte ICMP header + 2000 bytes of data).</w:t>
       </w:r>
     </w:p>
     <w:p>
@@ -444,28 +476,31 @@
     </w:p>
     <w:p>
       <w:r>
-        <w:t>The 3500-byte ICMP Echo Request is fragmented into 3 IP datagrams (ID = 0xdabb):</w:t>
+        <w:t>The 3500-byte ICMP Echo Request is fragmented into 3 IP datagrams (all sharing ID = 0xdabb):</w:t>
         <w:br/>
         <w:br/>
-        <w:t>Fragment 1: Total Length = 1500, MF = 1, Offset = 0</w:t>
+        <w:t>Fragment 1 (Frame 1513): Total Length = 1500, MF = 1, Offset = 0</w:t>
         <w:br/>
-        <w:t>Fragment 2: Total Length = 1500, MF = 1, Offset = 1480</w:t>
+        <w:t>Fragment 2 (Frame 1514): Total Length = 1500, MF = 1, Offset = 1480</w:t>
         <w:br/>
-        <w:t>Fragment 3: Total Length = 568,  MF = 0, Offset = 2960</w:t>
+        <w:t>Fragment 3 (Frame 1515): Total Length = 568,  MF = 0, Offset = 2960</w:t>
         <w:br/>
         <w:br/>
         <w:t>Fields that CHANGE among fragments:</w:t>
         <w:br/>
-        <w:t>1. Total Length — 1500, 1500, 568</w:t>
+        <w:t>1. Total Length — 1500, 1500, 568 bytes</w:t>
         <w:br/>
-        <w:t>2. More Fragments (MF) flag — 1, 1, 0</w:t>
+        <w:t>2. More Fragments (MF) flag — 1, 1, 0 (last fragment has MF = 0)</w:t>
         <w:br/>
-        <w:t>3. Fragment Offset — 0, 1480, 2960</w:t>
+        <w:t>3. Fragment Offset — 0, 1480, 2960 bytes (stored in 8-byte units: 0, 185, 370)</w:t>
         <w:br/>
-        <w:t>4. Header Checksum — recomputed for each fragment</w:t>
+        <w:t>4. Header Checksum — recomputed for each fragment since the above fields differ</w:t>
         <w:br/>
         <w:br/>
-        <w:t>Fields that stay the SAME: Version, IHL, DSCP, Identification (0xdabb), TTL (128), Protocol (ICMP/1), Source IP, Destination IP. The Identification must stay the same so the receiver can reassemble the fragments.</w:t>
+        <w:t>Fields that remain the SAME: Version (4), Header Length (20), DSCP (0x00), Identification (0xdabb), TTL (128), Protocol (ICMP/1), Source IP (192.168.68.75), Destination IP (128.93.162.83). The Identification must be identical across all fragments so the receiver can identify which fragments belong together and reassemble them.</w:t>
+        <w:br/>
+        <w:br/>
+        <w:t>Verification: Total data = 1480 + 1480 + 548 = 3508 bytes = 8 (ICMP header) + 3500 (data).</w:t>
       </w:r>
     </w:p>
     <w:p>
@@ -535,14 +570,15 @@
     </w:p>
     <w:p>
       <w:r>
-        <w:t>From the first ICMP Echo Request (Frame 579) in the ping capture:</w:t>
+        <w:t>From the first ICMP Echo Request (Frame 579) in the ping capture to www.ust.hk:</w:t>
+        <w:br/>
         <w:br/>
         <w:t>• My host IP address: 192.168.68.75</w:t>
         <w:br/>
-        <w:t>• Destination host IP address: 143.89.209.9 (www.ust.hk)</w:t>
+        <w:t>• Destination host IP address: 143.89.209.9 (www.ust.hk — Hong Kong University of Science and Technology)</w:t>
         <w:br/>
         <w:br/>
-        <w:t>My host uses a private IP address (192.168.68.0/22 subnet) behind a NAT router (TP-Link, 192.168.68.1).</w:t>
+        <w:t>My host uses a private IP address on the 192.168.68.0/22 subnet, behind a NAT router (TP-Link gateway at 192.168.68.1).</w:t>
       </w:r>
     </w:p>
     <w:p>
@@ -599,31 +635,30 @@
     </w:p>
     <w:p>
       <w:r>
-        <w:t>Ping Echo Request (Frame 579):</w:t>
+        <w:t>Examining the ICMP Echo Request (Frame 579):</w:t>
         <w:br/>
-        <w:t>• Type: 8 (Echo Request)</w:t>
+        <w:t>• ICMP Type: 8 (Echo Request)</w:t>
         <w:br/>
-        <w:t>• Code: 0</w:t>
+        <w:t>• ICMP Code: 0</w:t>
         <w:br/>
         <w:br/>
-        <w:t>Other fields:</w:t>
+        <w:t>Other fields in the ICMP packet:</w:t>
         <w:br/>
         <w:t>• Checksum: 0x010b — 2 bytes (16 bits)</w:t>
         <w:br/>
-        <w:t>• Identifier: 0x0007 — 2 bytes (16 bits)</w:t>
+        <w:t>• Identifier: 0x0007 (7) — 2 bytes (16 bits)</w:t>
         <w:br/>
         <w:t>• Sequence Number: 19530 (0x4c4a) — 2 bytes (16 bits)</w:t>
         <w:br/>
-        <w:t>• Data: 32 bytes of padding ("abcdefghijklmnop...")</w:t>
+        <w:t>• Data: 32 bytes of padding ("abcdefghijklmnopqrstuvwabcdefghi")</w:t>
         <w:br/>
         <w:br/>
-        <w:t>Corresponding Echo Reply (Frame 580):</w:t>
+        <w:t>Total ICMP header = Type (1B) + Code (1B) + Checksum (2B) + Identifier (2B) + Sequence (2B) = 8 bytes.</w:t>
         <w:br/>
-        <w:t>• Type: 0 (Echo Reply), Code: 0</w:t>
+        <w:t>Total ICMP message = 8 + 32 = 40 bytes, matching IP payload (Total Length 60 − IP Header 20 = 40).</w:t>
         <w:br/>
-        <w:t>• Checksum: 0x090b (2 bytes), Identifier: 0x0007 (2 bytes), Sequence: 19530 (2 bytes)</w:t>
         <w:br/>
-        <w:t>• The reply contains the same Identifier, Sequence Number, and Data as the request.</w:t>
+        <w:t>The corresponding Echo Reply (Frame 580) has Type = 0 (Echo Reply), Code = 0, Checksum = 0x090b, and the same Identifier (0x0007), Sequence Number (19530), and Data.</w:t>
       </w:r>
     </w:p>
     <w:p>
@@ -680,17 +715,19 @@
     </w:p>
     <w:p>
       <w:r>
-        <w:t>The tracert ICMP Echo Request (Frame 115) differs from the ping Echo Request:</w:t>
+        <w:t>The ICMP Echo Request from tracert (Frame 115) differs from the ping Echo Request (Frame 579) in several ways:</w:t>
         <w:br/>
         <w:br/>
-        <w:t>1. TTL: Tracert sets TTL = 1 (incrementing per hop), while ping uses TTL = 128 (Windows default). This is the fundamental difference — tracert uses low TTL values to discover intermediate routers.</w:t>
-        <w:br/>
-        <w:t>2. Data size: Tracert carries 64 bytes of all-zero padding; ping carries 32 bytes of "abcdefgh..." padding.</w:t>
-        <w:br/>
-        <w:t>3. IP Total Length: Tracert = 92 bytes (20 IP + 8 ICMP + 64 data); Ping = 60 bytes (20 + 8 + 32).</w:t>
+        <w:t>1. TTL: The tracert echo request has TTL = 1 (incrementing per hop), while the ping echo request has TTL = 128 (default Windows TTL). This is the fundamental difference — tracert deliberately sets low TTL values to elicit TTL-exceeded responses from each intermediate router.</w:t>
         <w:br/>
         <w:br/>
-        <w:t>Similarities: Both use Type 8 (Echo Request), Code 0, and have the same ICMP fields (Checksum, Identifier, Sequence Number).</w:t>
+        <w:t>2. Data size: The tracert echo request carries 64 bytes of all-zero (0x00) padding, while the ping request carries 32 bytes of alphabetic padding ("abcdefgh...").</w:t>
+        <w:br/>
+        <w:br/>
+        <w:t>3. IP Total Length: Tracert = 92 bytes (20 IP + 8 ICMP header + 64 data) vs. Ping = 60 bytes (20 IP + 8 ICMP header + 32 data).</w:t>
+        <w:br/>
+        <w:br/>
+        <w:t>Similarities: Both use ICMP Type 8 (Echo Request) and Code 0, and both contain the same ICMP fields (Checksum, Identifier, Sequence Number). Both share the same Identifier value (0x0007).</w:t>
       </w:r>
     </w:p>
     <w:p>
@@ -758,7 +795,7 @@
               <a:graphicData uri="http://schemas.openxmlformats.org/drawingml/2006/picture">
                 <pic:pic>
                   <pic:nvPicPr>
-                    <pic:cNvPr id="0" name="icmp_q9_last_packets.png"/>
+                    <pic:cNvPr id="0" name="icmp_q9_echo_reply.png"/>
                     <pic:cNvPicPr/>
                   </pic:nvPicPr>
                   <pic:blipFill>
@@ -783,21 +820,25 @@
     </w:p>
     <w:p>
       <w:r>
-        <w:t>The last three ICMP packets received are TTL-exceeded (Type 11, Code 0) messages from the 9th hop router (213.144.183.207). In our trace, the tracert to www.inria.fr did not fully complete.</w:t>
+        <w:t>In a complete tracert, the last three ICMP packets received by the source are Echo Reply (Type 0, Code 0) messages from the destination host, rather than TTL-exceeded (Type 11, Code 0) error messages from intermediate routers.</w:t>
         <w:br/>
         <w:br/>
-        <w:t>In a complete tracert, the last three packets would be Echo Reply (Type 0, Code 0) from the destination host (128.93.162.83) rather than TTL-exceeded errors from intermediate routers.</w:t>
+        <w:t>The key differences between these Echo Reply packets and the earlier TTL-exceeded error packets are:</w:t>
         <w:br/>
         <w:br/>
-        <w:t>Key differences between Echo Reply and TTL-exceeded:</w:t>
+        <w:t>1. ICMP Type: Echo Reply = Type 0; TTL-exceeded = Type 11.</w:t>
         <w:br/>
-        <w:t>1. Type: Echo Reply = Type 0; TTL-exceeded = Type 11</w:t>
         <w:br/>
-        <w:t>2. Source IP: Echo Reply comes from the destination; TTL-exceeded comes from intermediate routers</w:t>
+        <w:t>2. Source IP: Echo Reply comes from the final destination (e.g., 128.93.162.83 for www.inria.fr), while TTL-exceeded comes from intermediate routers along the path.</w:t>
         <w:br/>
-        <w:t>3. Payload: TTL-exceeded packets contain the original IP header + first 8 bytes of the triggering packet (encapsulated). Echo Reply simply echoes back the original data.</w:t>
         <w:br/>
-        <w:t>4. Why different: The last-hop probes reach the destination without TTL expiring, so the destination responds with an Echo Reply instead of a router dropping the packet.</w:t>
+        <w:t>3. Payload structure: TTL-exceeded error packets contain extra fields — specifically, the complete IP header plus the first 8 bytes of the original datagram that triggered the error (the encapsulated ICMP header). This is visible in the first screenshot (Frame 116) where the TTL-exceeded packet from 192.168.68.1 contains the original IP header (Src=192.168.68.75, Dst=128.93.162.83) and original ICMP header (Type 8, ID=0x0007). Echo Reply packets simply echo back the data from the request without encapsulating any IP headers.</w:t>
+        <w:br/>
+        <w:br/>
+        <w:t>4. Why they are different: The last-hop probe packets have a TTL large enough to reach the destination without expiring at any intermediate router. Therefore, instead of a router dropping the packet and generating a TTL-exceeded error, the destination host itself receives the Echo Request and responds with an Echo Reply. The second screenshot shows an Echo Reply (Type 0) from the ping capture as an example of this packet type.</w:t>
+        <w:br/>
+        <w:br/>
+        <w:t>Note: In our tracert capture, the trace to www.inria.fr reached hop 9 (213.144.183.207) before the capture ended. The destination (128.93.162.83) is approximately 11 hops away (inferred from the reply TTL of 53 in ping, i.e., 64 − 53 = 11 hops), so a longer capture would have shown the expected Echo Replies.</w:t>
       </w:r>
     </w:p>
     <w:sectPr>

</xml_diff>